<commit_message>
Added Configuration table in the template doc
Added the missing Configuration table in the template word document.

Usable for when submitting the IROB level 3 ISAT
</commit_message>
<xml_diff>
--- a/Data/IROB_Template_Level_3_ISAT.docx
+++ b/Data/IROB_Template_Level_3_ISAT.docx
@@ -745,6 +745,922 @@
         <w:t>: BREADBOARD DESIGN</w:t>
       </w:r>
     </w:p>
+    <w:tbl>
+      <w:tblPr>
+        <w:tblStyle w:val="GridTable3-Accent6"/>
+        <w:tblW w:w="0" w:type="auto"/>
+        <w:tblLook w:val="04A0" w:firstRow="1" w:lastRow="0" w:firstColumn="1" w:lastColumn="0" w:noHBand="0" w:noVBand="1"/>
+      </w:tblPr>
+      <w:tblGrid>
+        <w:gridCol w:w="2254"/>
+        <w:gridCol w:w="2254"/>
+        <w:gridCol w:w="2254"/>
+        <w:gridCol w:w="2254"/>
+      </w:tblGrid>
+      <w:tr>
+        <w:trPr>
+          <w:cnfStyle w:val="100000000000" w:firstRow="1" w:lastRow="0" w:firstColumn="0" w:lastColumn="0" w:oddVBand="0" w:evenVBand="0" w:oddHBand="0" w:evenHBand="0" w:firstRowFirstColumn="0" w:firstRowLastColumn="0" w:lastRowFirstColumn="0" w:lastRowLastColumn="0"/>
+        </w:trPr>
+        <w:tc>
+          <w:tcPr>
+            <w:cnfStyle w:val="001000000100" w:firstRow="0" w:lastRow="0" w:firstColumn="1" w:lastColumn="0" w:oddVBand="0" w:evenVBand="0" w:oddHBand="0" w:evenHBand="0" w:firstRowFirstColumn="1" w:firstRowLastColumn="0" w:lastRowFirstColumn="0" w:lastRowLastColumn="0"/>
+            <w:tcW w:w="2254" w:type="dxa"/>
+          </w:tcPr>
+          <w:p>
+            <w:r>
+              <w:t>COMPONENT</w:t>
+            </w:r>
+          </w:p>
+        </w:tc>
+        <w:tc>
+          <w:tcPr>
+            <w:tcW w:w="2254" w:type="dxa"/>
+          </w:tcPr>
+          <w:p>
+            <w:pPr>
+              <w:jc w:val="right"/>
+              <w:cnfStyle w:val="100000000000" w:firstRow="1" w:lastRow="0" w:firstColumn="0" w:lastColumn="0" w:oddVBand="0" w:evenVBand="0" w:oddHBand="0" w:evenHBand="0" w:firstRowFirstColumn="0" w:firstRowLastColumn="0" w:lastRowFirstColumn="0" w:lastRowLastColumn="0"/>
+              <w:rPr>
+                <w:i/>
+                <w:iCs/>
+              </w:rPr>
+            </w:pPr>
+            <w:r>
+              <w:rPr>
+                <w:i/>
+                <w:iCs/>
+              </w:rPr>
+              <w:t>CONFIG</w:t>
+            </w:r>
+          </w:p>
+        </w:tc>
+        <w:tc>
+          <w:tcPr>
+            <w:tcW w:w="2254" w:type="dxa"/>
+          </w:tcPr>
+          <w:p>
+            <w:pPr>
+              <w:jc w:val="right"/>
+              <w:cnfStyle w:val="100000000000" w:firstRow="1" w:lastRow="0" w:firstColumn="0" w:lastColumn="0" w:oddVBand="0" w:evenVBand="0" w:oddHBand="0" w:evenHBand="0" w:firstRowFirstColumn="0" w:firstRowLastColumn="0" w:lastRowFirstColumn="0" w:lastRowLastColumn="0"/>
+              <w:rPr>
+                <w:i/>
+                <w:iCs/>
+              </w:rPr>
+            </w:pPr>
+            <w:r>
+              <w:rPr>
+                <w:i/>
+                <w:iCs/>
+              </w:rPr>
+              <w:t>DESCRIPTION</w:t>
+            </w:r>
+          </w:p>
+        </w:tc>
+        <w:tc>
+          <w:tcPr>
+            <w:tcW w:w="2254" w:type="dxa"/>
+          </w:tcPr>
+          <w:p>
+            <w:pPr>
+              <w:jc w:val="right"/>
+              <w:cnfStyle w:val="100000000000" w:firstRow="1" w:lastRow="0" w:firstColumn="0" w:lastColumn="0" w:oddVBand="0" w:evenVBand="0" w:oddHBand="0" w:evenHBand="0" w:firstRowFirstColumn="0" w:firstRowLastColumn="0" w:lastRowFirstColumn="0" w:lastRowLastColumn="0"/>
+              <w:rPr>
+                <w:i/>
+                <w:iCs/>
+              </w:rPr>
+            </w:pPr>
+            <w:r>
+              <w:rPr>
+                <w:i/>
+                <w:iCs/>
+              </w:rPr>
+              <w:t>ARDUINO PIN</w:t>
+            </w:r>
+          </w:p>
+        </w:tc>
+      </w:tr>
+      <w:tr>
+        <w:trPr>
+          <w:cnfStyle w:val="000000100000" w:firstRow="0" w:lastRow="0" w:firstColumn="0" w:lastColumn="0" w:oddVBand="0" w:evenVBand="0" w:oddHBand="1" w:evenHBand="0" w:firstRowFirstColumn="0" w:firstRowLastColumn="0" w:lastRowFirstColumn="0" w:lastRowLastColumn="0"/>
+        </w:trPr>
+        <w:tc>
+          <w:tcPr>
+            <w:cnfStyle w:val="001000000000" w:firstRow="0" w:lastRow="0" w:firstColumn="1" w:lastColumn="0" w:oddVBand="0" w:evenVBand="0" w:oddHBand="0" w:evenHBand="0" w:firstRowFirstColumn="0" w:firstRowLastColumn="0" w:lastRowFirstColumn="0" w:lastRowLastColumn="0"/>
+            <w:tcW w:w="2254" w:type="dxa"/>
+          </w:tcPr>
+          <w:p>
+            <w:r>
+              <w:t>Left IR Sensor</w:t>
+            </w:r>
+          </w:p>
+        </w:tc>
+        <w:tc>
+          <w:tcPr>
+            <w:tcW w:w="2254" w:type="dxa"/>
+          </w:tcPr>
+          <w:p>
+            <w:pPr>
+              <w:jc w:val="right"/>
+              <w:cnfStyle w:val="000000100000" w:firstRow="0" w:lastRow="0" w:firstColumn="0" w:lastColumn="0" w:oddVBand="0" w:evenVBand="0" w:oddHBand="1" w:evenHBand="0" w:firstRowFirstColumn="0" w:firstRowLastColumn="0" w:lastRowFirstColumn="0" w:lastRowLastColumn="0"/>
+            </w:pPr>
+            <w:r>
+              <w:t>OUT</w:t>
+            </w:r>
+          </w:p>
+        </w:tc>
+        <w:tc>
+          <w:tcPr>
+            <w:tcW w:w="2254" w:type="dxa"/>
+          </w:tcPr>
+          <w:p>
+            <w:pPr>
+              <w:jc w:val="right"/>
+              <w:cnfStyle w:val="000000100000" w:firstRow="0" w:lastRow="0" w:firstColumn="0" w:lastColumn="0" w:oddVBand="0" w:evenVBand="0" w:oddHBand="1" w:evenHBand="0" w:firstRowFirstColumn="0" w:firstRowLastColumn="0" w:lastRowFirstColumn="0" w:lastRowLastColumn="0"/>
+            </w:pPr>
+          </w:p>
+        </w:tc>
+        <w:tc>
+          <w:tcPr>
+            <w:tcW w:w="2254" w:type="dxa"/>
+          </w:tcPr>
+          <w:p>
+            <w:pPr>
+              <w:jc w:val="right"/>
+              <w:cnfStyle w:val="000000100000" w:firstRow="0" w:lastRow="0" w:firstColumn="0" w:lastColumn="0" w:oddVBand="0" w:evenVBand="0" w:oddHBand="1" w:evenHBand="0" w:firstRowFirstColumn="0" w:firstRowLastColumn="0" w:lastRowFirstColumn="0" w:lastRowLastColumn="0"/>
+            </w:pPr>
+          </w:p>
+        </w:tc>
+      </w:tr>
+      <w:tr>
+        <w:tc>
+          <w:tcPr>
+            <w:cnfStyle w:val="001000000000" w:firstRow="0" w:lastRow="0" w:firstColumn="1" w:lastColumn="0" w:oddVBand="0" w:evenVBand="0" w:oddHBand="0" w:evenHBand="0" w:firstRowFirstColumn="0" w:firstRowLastColumn="0" w:lastRowFirstColumn="0" w:lastRowLastColumn="0"/>
+            <w:tcW w:w="2254" w:type="dxa"/>
+          </w:tcPr>
+          <w:p/>
+        </w:tc>
+        <w:tc>
+          <w:tcPr>
+            <w:tcW w:w="2254" w:type="dxa"/>
+          </w:tcPr>
+          <w:p>
+            <w:pPr>
+              <w:jc w:val="right"/>
+              <w:cnfStyle w:val="000000000000" w:firstRow="0" w:lastRow="0" w:firstColumn="0" w:lastColumn="0" w:oddVBand="0" w:evenVBand="0" w:oddHBand="0" w:evenHBand="0" w:firstRowFirstColumn="0" w:firstRowLastColumn="0" w:lastRowFirstColumn="0" w:lastRowLastColumn="0"/>
+            </w:pPr>
+            <w:r>
+              <w:t>VCC</w:t>
+            </w:r>
+          </w:p>
+        </w:tc>
+        <w:tc>
+          <w:tcPr>
+            <w:tcW w:w="2254" w:type="dxa"/>
+          </w:tcPr>
+          <w:p>
+            <w:pPr>
+              <w:jc w:val="right"/>
+              <w:cnfStyle w:val="000000000000" w:firstRow="0" w:lastRow="0" w:firstColumn="0" w:lastColumn="0" w:oddVBand="0" w:evenVBand="0" w:oddHBand="0" w:evenHBand="0" w:firstRowFirstColumn="0" w:firstRowLastColumn="0" w:lastRowFirstColumn="0" w:lastRowLastColumn="0"/>
+            </w:pPr>
+          </w:p>
+        </w:tc>
+        <w:tc>
+          <w:tcPr>
+            <w:tcW w:w="2254" w:type="dxa"/>
+          </w:tcPr>
+          <w:p>
+            <w:pPr>
+              <w:jc w:val="right"/>
+              <w:cnfStyle w:val="000000000000" w:firstRow="0" w:lastRow="0" w:firstColumn="0" w:lastColumn="0" w:oddVBand="0" w:evenVBand="0" w:oddHBand="0" w:evenHBand="0" w:firstRowFirstColumn="0" w:firstRowLastColumn="0" w:lastRowFirstColumn="0" w:lastRowLastColumn="0"/>
+            </w:pPr>
+          </w:p>
+        </w:tc>
+      </w:tr>
+      <w:tr>
+        <w:trPr>
+          <w:cnfStyle w:val="000000100000" w:firstRow="0" w:lastRow="0" w:firstColumn="0" w:lastColumn="0" w:oddVBand="0" w:evenVBand="0" w:oddHBand="1" w:evenHBand="0" w:firstRowFirstColumn="0" w:firstRowLastColumn="0" w:lastRowFirstColumn="0" w:lastRowLastColumn="0"/>
+        </w:trPr>
+        <w:tc>
+          <w:tcPr>
+            <w:cnfStyle w:val="001000000000" w:firstRow="0" w:lastRow="0" w:firstColumn="1" w:lastColumn="0" w:oddVBand="0" w:evenVBand="0" w:oddHBand="0" w:evenHBand="0" w:firstRowFirstColumn="0" w:firstRowLastColumn="0" w:lastRowFirstColumn="0" w:lastRowLastColumn="0"/>
+            <w:tcW w:w="2254" w:type="dxa"/>
+          </w:tcPr>
+          <w:p/>
+        </w:tc>
+        <w:tc>
+          <w:tcPr>
+            <w:tcW w:w="2254" w:type="dxa"/>
+          </w:tcPr>
+          <w:p>
+            <w:pPr>
+              <w:jc w:val="right"/>
+              <w:cnfStyle w:val="000000100000" w:firstRow="0" w:lastRow="0" w:firstColumn="0" w:lastColumn="0" w:oddVBand="0" w:evenVBand="0" w:oddHBand="1" w:evenHBand="0" w:firstRowFirstColumn="0" w:firstRowLastColumn="0" w:lastRowFirstColumn="0" w:lastRowLastColumn="0"/>
+            </w:pPr>
+            <w:r>
+              <w:t>GND</w:t>
+            </w:r>
+          </w:p>
+        </w:tc>
+        <w:tc>
+          <w:tcPr>
+            <w:tcW w:w="2254" w:type="dxa"/>
+          </w:tcPr>
+          <w:p>
+            <w:pPr>
+              <w:jc w:val="right"/>
+              <w:cnfStyle w:val="000000100000" w:firstRow="0" w:lastRow="0" w:firstColumn="0" w:lastColumn="0" w:oddVBand="0" w:evenVBand="0" w:oddHBand="1" w:evenHBand="0" w:firstRowFirstColumn="0" w:firstRowLastColumn="0" w:lastRowFirstColumn="0" w:lastRowLastColumn="0"/>
+            </w:pPr>
+          </w:p>
+        </w:tc>
+        <w:tc>
+          <w:tcPr>
+            <w:tcW w:w="2254" w:type="dxa"/>
+          </w:tcPr>
+          <w:p>
+            <w:pPr>
+              <w:jc w:val="right"/>
+              <w:cnfStyle w:val="000000100000" w:firstRow="0" w:lastRow="0" w:firstColumn="0" w:lastColumn="0" w:oddVBand="0" w:evenVBand="0" w:oddHBand="1" w:evenHBand="0" w:firstRowFirstColumn="0" w:firstRowLastColumn="0" w:lastRowFirstColumn="0" w:lastRowLastColumn="0"/>
+            </w:pPr>
+          </w:p>
+        </w:tc>
+      </w:tr>
+      <w:tr>
+        <w:tc>
+          <w:tcPr>
+            <w:cnfStyle w:val="001000000000" w:firstRow="0" w:lastRow="0" w:firstColumn="1" w:lastColumn="0" w:oddVBand="0" w:evenVBand="0" w:oddHBand="0" w:evenHBand="0" w:firstRowFirstColumn="0" w:firstRowLastColumn="0" w:lastRowFirstColumn="0" w:lastRowLastColumn="0"/>
+            <w:tcW w:w="2254" w:type="dxa"/>
+          </w:tcPr>
+          <w:p>
+            <w:r>
+              <w:t>RIGHT IR Sensor</w:t>
+            </w:r>
+          </w:p>
+        </w:tc>
+        <w:tc>
+          <w:tcPr>
+            <w:tcW w:w="2254" w:type="dxa"/>
+          </w:tcPr>
+          <w:p>
+            <w:pPr>
+              <w:jc w:val="right"/>
+              <w:cnfStyle w:val="000000000000" w:firstRow="0" w:lastRow="0" w:firstColumn="0" w:lastColumn="0" w:oddVBand="0" w:evenVBand="0" w:oddHBand="0" w:evenHBand="0" w:firstRowFirstColumn="0" w:firstRowLastColumn="0" w:lastRowFirstColumn="0" w:lastRowLastColumn="0"/>
+            </w:pPr>
+            <w:r>
+              <w:t>OUT</w:t>
+            </w:r>
+          </w:p>
+        </w:tc>
+        <w:tc>
+          <w:tcPr>
+            <w:tcW w:w="2254" w:type="dxa"/>
+          </w:tcPr>
+          <w:p>
+            <w:pPr>
+              <w:jc w:val="right"/>
+              <w:cnfStyle w:val="000000000000" w:firstRow="0" w:lastRow="0" w:firstColumn="0" w:lastColumn="0" w:oddVBand="0" w:evenVBand="0" w:oddHBand="0" w:evenHBand="0" w:firstRowFirstColumn="0" w:firstRowLastColumn="0" w:lastRowFirstColumn="0" w:lastRowLastColumn="0"/>
+            </w:pPr>
+          </w:p>
+        </w:tc>
+        <w:tc>
+          <w:tcPr>
+            <w:tcW w:w="2254" w:type="dxa"/>
+          </w:tcPr>
+          <w:p>
+            <w:pPr>
+              <w:jc w:val="right"/>
+              <w:cnfStyle w:val="000000000000" w:firstRow="0" w:lastRow="0" w:firstColumn="0" w:lastColumn="0" w:oddVBand="0" w:evenVBand="0" w:oddHBand="0" w:evenHBand="0" w:firstRowFirstColumn="0" w:firstRowLastColumn="0" w:lastRowFirstColumn="0" w:lastRowLastColumn="0"/>
+            </w:pPr>
+          </w:p>
+        </w:tc>
+      </w:tr>
+      <w:tr>
+        <w:trPr>
+          <w:cnfStyle w:val="000000100000" w:firstRow="0" w:lastRow="0" w:firstColumn="0" w:lastColumn="0" w:oddVBand="0" w:evenVBand="0" w:oddHBand="1" w:evenHBand="0" w:firstRowFirstColumn="0" w:firstRowLastColumn="0" w:lastRowFirstColumn="0" w:lastRowLastColumn="0"/>
+        </w:trPr>
+        <w:tc>
+          <w:tcPr>
+            <w:cnfStyle w:val="001000000000" w:firstRow="0" w:lastRow="0" w:firstColumn="1" w:lastColumn="0" w:oddVBand="0" w:evenVBand="0" w:oddHBand="0" w:evenHBand="0" w:firstRowFirstColumn="0" w:firstRowLastColumn="0" w:lastRowFirstColumn="0" w:lastRowLastColumn="0"/>
+            <w:tcW w:w="2254" w:type="dxa"/>
+          </w:tcPr>
+          <w:p/>
+        </w:tc>
+        <w:tc>
+          <w:tcPr>
+            <w:tcW w:w="2254" w:type="dxa"/>
+          </w:tcPr>
+          <w:p>
+            <w:pPr>
+              <w:jc w:val="right"/>
+              <w:cnfStyle w:val="000000100000" w:firstRow="0" w:lastRow="0" w:firstColumn="0" w:lastColumn="0" w:oddVBand="0" w:evenVBand="0" w:oddHBand="1" w:evenHBand="0" w:firstRowFirstColumn="0" w:firstRowLastColumn="0" w:lastRowFirstColumn="0" w:lastRowLastColumn="0"/>
+            </w:pPr>
+            <w:r>
+              <w:t>VCC</w:t>
+            </w:r>
+          </w:p>
+        </w:tc>
+        <w:tc>
+          <w:tcPr>
+            <w:tcW w:w="2254" w:type="dxa"/>
+          </w:tcPr>
+          <w:p>
+            <w:pPr>
+              <w:jc w:val="right"/>
+              <w:cnfStyle w:val="000000100000" w:firstRow="0" w:lastRow="0" w:firstColumn="0" w:lastColumn="0" w:oddVBand="0" w:evenVBand="0" w:oddHBand="1" w:evenHBand="0" w:firstRowFirstColumn="0" w:firstRowLastColumn="0" w:lastRowFirstColumn="0" w:lastRowLastColumn="0"/>
+            </w:pPr>
+          </w:p>
+        </w:tc>
+        <w:tc>
+          <w:tcPr>
+            <w:tcW w:w="2254" w:type="dxa"/>
+          </w:tcPr>
+          <w:p>
+            <w:pPr>
+              <w:jc w:val="right"/>
+              <w:cnfStyle w:val="000000100000" w:firstRow="0" w:lastRow="0" w:firstColumn="0" w:lastColumn="0" w:oddVBand="0" w:evenVBand="0" w:oddHBand="1" w:evenHBand="0" w:firstRowFirstColumn="0" w:firstRowLastColumn="0" w:lastRowFirstColumn="0" w:lastRowLastColumn="0"/>
+            </w:pPr>
+          </w:p>
+        </w:tc>
+      </w:tr>
+      <w:tr>
+        <w:tc>
+          <w:tcPr>
+            <w:cnfStyle w:val="001000000000" w:firstRow="0" w:lastRow="0" w:firstColumn="1" w:lastColumn="0" w:oddVBand="0" w:evenVBand="0" w:oddHBand="0" w:evenHBand="0" w:firstRowFirstColumn="0" w:firstRowLastColumn="0" w:lastRowFirstColumn="0" w:lastRowLastColumn="0"/>
+            <w:tcW w:w="2254" w:type="dxa"/>
+          </w:tcPr>
+          <w:p/>
+        </w:tc>
+        <w:tc>
+          <w:tcPr>
+            <w:tcW w:w="2254" w:type="dxa"/>
+          </w:tcPr>
+          <w:p>
+            <w:pPr>
+              <w:jc w:val="right"/>
+              <w:cnfStyle w:val="000000000000" w:firstRow="0" w:lastRow="0" w:firstColumn="0" w:lastColumn="0" w:oddVBand="0" w:evenVBand="0" w:oddHBand="0" w:evenHBand="0" w:firstRowFirstColumn="0" w:firstRowLastColumn="0" w:lastRowFirstColumn="0" w:lastRowLastColumn="0"/>
+            </w:pPr>
+            <w:r>
+              <w:t>GND</w:t>
+            </w:r>
+          </w:p>
+        </w:tc>
+        <w:tc>
+          <w:tcPr>
+            <w:tcW w:w="2254" w:type="dxa"/>
+          </w:tcPr>
+          <w:p>
+            <w:pPr>
+              <w:jc w:val="right"/>
+              <w:cnfStyle w:val="000000000000" w:firstRow="0" w:lastRow="0" w:firstColumn="0" w:lastColumn="0" w:oddVBand="0" w:evenVBand="0" w:oddHBand="0" w:evenHBand="0" w:firstRowFirstColumn="0" w:firstRowLastColumn="0" w:lastRowFirstColumn="0" w:lastRowLastColumn="0"/>
+            </w:pPr>
+          </w:p>
+        </w:tc>
+        <w:tc>
+          <w:tcPr>
+            <w:tcW w:w="2254" w:type="dxa"/>
+          </w:tcPr>
+          <w:p>
+            <w:pPr>
+              <w:jc w:val="right"/>
+              <w:cnfStyle w:val="000000000000" w:firstRow="0" w:lastRow="0" w:firstColumn="0" w:lastColumn="0" w:oddVBand="0" w:evenVBand="0" w:oddHBand="0" w:evenHBand="0" w:firstRowFirstColumn="0" w:firstRowLastColumn="0" w:lastRowFirstColumn="0" w:lastRowLastColumn="0"/>
+            </w:pPr>
+          </w:p>
+        </w:tc>
+      </w:tr>
+      <w:tr>
+        <w:trPr>
+          <w:cnfStyle w:val="000000100000" w:firstRow="0" w:lastRow="0" w:firstColumn="0" w:lastColumn="0" w:oddVBand="0" w:evenVBand="0" w:oddHBand="1" w:evenHBand="0" w:firstRowFirstColumn="0" w:firstRowLastColumn="0" w:lastRowFirstColumn="0" w:lastRowLastColumn="0"/>
+        </w:trPr>
+        <w:tc>
+          <w:tcPr>
+            <w:cnfStyle w:val="001000000000" w:firstRow="0" w:lastRow="0" w:firstColumn="1" w:lastColumn="0" w:oddVBand="0" w:evenVBand="0" w:oddHBand="0" w:evenHBand="0" w:firstRowFirstColumn="0" w:firstRowLastColumn="0" w:lastRowFirstColumn="0" w:lastRowLastColumn="0"/>
+            <w:tcW w:w="2254" w:type="dxa"/>
+          </w:tcPr>
+          <w:p>
+            <w:r>
+              <w:t>L298N Motor Driver</w:t>
+            </w:r>
+          </w:p>
+        </w:tc>
+        <w:tc>
+          <w:tcPr>
+            <w:tcW w:w="2254" w:type="dxa"/>
+          </w:tcPr>
+          <w:p>
+            <w:pPr>
+              <w:jc w:val="right"/>
+              <w:cnfStyle w:val="000000100000" w:firstRow="0" w:lastRow="0" w:firstColumn="0" w:lastColumn="0" w:oddVBand="0" w:evenVBand="0" w:oddHBand="1" w:evenHBand="0" w:firstRowFirstColumn="0" w:firstRowLastColumn="0" w:lastRowFirstColumn="0" w:lastRowLastColumn="0"/>
+            </w:pPr>
+            <w:r>
+              <w:t>ENA</w:t>
+            </w:r>
+          </w:p>
+        </w:tc>
+        <w:tc>
+          <w:tcPr>
+            <w:tcW w:w="2254" w:type="dxa"/>
+          </w:tcPr>
+          <w:p>
+            <w:pPr>
+              <w:jc w:val="right"/>
+              <w:cnfStyle w:val="000000100000" w:firstRow="0" w:lastRow="0" w:firstColumn="0" w:lastColumn="0" w:oddVBand="0" w:evenVBand="0" w:oddHBand="1" w:evenHBand="0" w:firstRowFirstColumn="0" w:firstRowLastColumn="0" w:lastRowFirstColumn="0" w:lastRowLastColumn="0"/>
+            </w:pPr>
+          </w:p>
+        </w:tc>
+        <w:tc>
+          <w:tcPr>
+            <w:tcW w:w="2254" w:type="dxa"/>
+          </w:tcPr>
+          <w:p>
+            <w:pPr>
+              <w:jc w:val="right"/>
+              <w:cnfStyle w:val="000000100000" w:firstRow="0" w:lastRow="0" w:firstColumn="0" w:lastColumn="0" w:oddVBand="0" w:evenVBand="0" w:oddHBand="1" w:evenHBand="0" w:firstRowFirstColumn="0" w:firstRowLastColumn="0" w:lastRowFirstColumn="0" w:lastRowLastColumn="0"/>
+            </w:pPr>
+          </w:p>
+        </w:tc>
+      </w:tr>
+      <w:tr>
+        <w:tc>
+          <w:tcPr>
+            <w:cnfStyle w:val="001000000000" w:firstRow="0" w:lastRow="0" w:firstColumn="1" w:lastColumn="0" w:oddVBand="0" w:evenVBand="0" w:oddHBand="0" w:evenHBand="0" w:firstRowFirstColumn="0" w:firstRowLastColumn="0" w:lastRowFirstColumn="0" w:lastRowLastColumn="0"/>
+            <w:tcW w:w="2254" w:type="dxa"/>
+          </w:tcPr>
+          <w:p/>
+        </w:tc>
+        <w:tc>
+          <w:tcPr>
+            <w:tcW w:w="2254" w:type="dxa"/>
+          </w:tcPr>
+          <w:p>
+            <w:pPr>
+              <w:jc w:val="right"/>
+              <w:cnfStyle w:val="000000000000" w:firstRow="0" w:lastRow="0" w:firstColumn="0" w:lastColumn="0" w:oddVBand="0" w:evenVBand="0" w:oddHBand="0" w:evenHBand="0" w:firstRowFirstColumn="0" w:firstRowLastColumn="0" w:lastRowFirstColumn="0" w:lastRowLastColumn="0"/>
+            </w:pPr>
+            <w:r>
+              <w:t>IN1</w:t>
+            </w:r>
+          </w:p>
+        </w:tc>
+        <w:tc>
+          <w:tcPr>
+            <w:tcW w:w="2254" w:type="dxa"/>
+          </w:tcPr>
+          <w:p>
+            <w:pPr>
+              <w:jc w:val="right"/>
+              <w:cnfStyle w:val="000000000000" w:firstRow="0" w:lastRow="0" w:firstColumn="0" w:lastColumn="0" w:oddVBand="0" w:evenVBand="0" w:oddHBand="0" w:evenHBand="0" w:firstRowFirstColumn="0" w:firstRowLastColumn="0" w:lastRowFirstColumn="0" w:lastRowLastColumn="0"/>
+            </w:pPr>
+          </w:p>
+        </w:tc>
+        <w:tc>
+          <w:tcPr>
+            <w:tcW w:w="2254" w:type="dxa"/>
+          </w:tcPr>
+          <w:p>
+            <w:pPr>
+              <w:jc w:val="right"/>
+              <w:cnfStyle w:val="000000000000" w:firstRow="0" w:lastRow="0" w:firstColumn="0" w:lastColumn="0" w:oddVBand="0" w:evenVBand="0" w:oddHBand="0" w:evenHBand="0" w:firstRowFirstColumn="0" w:firstRowLastColumn="0" w:lastRowFirstColumn="0" w:lastRowLastColumn="0"/>
+            </w:pPr>
+          </w:p>
+        </w:tc>
+      </w:tr>
+      <w:tr>
+        <w:trPr>
+          <w:cnfStyle w:val="000000100000" w:firstRow="0" w:lastRow="0" w:firstColumn="0" w:lastColumn="0" w:oddVBand="0" w:evenVBand="0" w:oddHBand="1" w:evenHBand="0" w:firstRowFirstColumn="0" w:firstRowLastColumn="0" w:lastRowFirstColumn="0" w:lastRowLastColumn="0"/>
+        </w:trPr>
+        <w:tc>
+          <w:tcPr>
+            <w:cnfStyle w:val="001000000000" w:firstRow="0" w:lastRow="0" w:firstColumn="1" w:lastColumn="0" w:oddVBand="0" w:evenVBand="0" w:oddHBand="0" w:evenHBand="0" w:firstRowFirstColumn="0" w:firstRowLastColumn="0" w:lastRowFirstColumn="0" w:lastRowLastColumn="0"/>
+            <w:tcW w:w="2254" w:type="dxa"/>
+          </w:tcPr>
+          <w:p/>
+        </w:tc>
+        <w:tc>
+          <w:tcPr>
+            <w:tcW w:w="2254" w:type="dxa"/>
+          </w:tcPr>
+          <w:p>
+            <w:pPr>
+              <w:jc w:val="right"/>
+              <w:cnfStyle w:val="000000100000" w:firstRow="0" w:lastRow="0" w:firstColumn="0" w:lastColumn="0" w:oddVBand="0" w:evenVBand="0" w:oddHBand="1" w:evenHBand="0" w:firstRowFirstColumn="0" w:firstRowLastColumn="0" w:lastRowFirstColumn="0" w:lastRowLastColumn="0"/>
+            </w:pPr>
+            <w:r>
+              <w:t>IN2</w:t>
+            </w:r>
+          </w:p>
+        </w:tc>
+        <w:tc>
+          <w:tcPr>
+            <w:tcW w:w="2254" w:type="dxa"/>
+          </w:tcPr>
+          <w:p>
+            <w:pPr>
+              <w:jc w:val="right"/>
+              <w:cnfStyle w:val="000000100000" w:firstRow="0" w:lastRow="0" w:firstColumn="0" w:lastColumn="0" w:oddVBand="0" w:evenVBand="0" w:oddHBand="1" w:evenHBand="0" w:firstRowFirstColumn="0" w:firstRowLastColumn="0" w:lastRowFirstColumn="0" w:lastRowLastColumn="0"/>
+            </w:pPr>
+          </w:p>
+        </w:tc>
+        <w:tc>
+          <w:tcPr>
+            <w:tcW w:w="2254" w:type="dxa"/>
+          </w:tcPr>
+          <w:p>
+            <w:pPr>
+              <w:jc w:val="right"/>
+              <w:cnfStyle w:val="000000100000" w:firstRow="0" w:lastRow="0" w:firstColumn="0" w:lastColumn="0" w:oddVBand="0" w:evenVBand="0" w:oddHBand="1" w:evenHBand="0" w:firstRowFirstColumn="0" w:firstRowLastColumn="0" w:lastRowFirstColumn="0" w:lastRowLastColumn="0"/>
+            </w:pPr>
+          </w:p>
+        </w:tc>
+      </w:tr>
+      <w:tr>
+        <w:tc>
+          <w:tcPr>
+            <w:cnfStyle w:val="001000000000" w:firstRow="0" w:lastRow="0" w:firstColumn="1" w:lastColumn="0" w:oddVBand="0" w:evenVBand="0" w:oddHBand="0" w:evenHBand="0" w:firstRowFirstColumn="0" w:firstRowLastColumn="0" w:lastRowFirstColumn="0" w:lastRowLastColumn="0"/>
+            <w:tcW w:w="2254" w:type="dxa"/>
+          </w:tcPr>
+          <w:p/>
+        </w:tc>
+        <w:tc>
+          <w:tcPr>
+            <w:tcW w:w="2254" w:type="dxa"/>
+          </w:tcPr>
+          <w:p>
+            <w:pPr>
+              <w:jc w:val="right"/>
+              <w:cnfStyle w:val="000000000000" w:firstRow="0" w:lastRow="0" w:firstColumn="0" w:lastColumn="0" w:oddVBand="0" w:evenVBand="0" w:oddHBand="0" w:evenHBand="0" w:firstRowFirstColumn="0" w:firstRowLastColumn="0" w:lastRowFirstColumn="0" w:lastRowLastColumn="0"/>
+            </w:pPr>
+            <w:r>
+              <w:t>IN3</w:t>
+            </w:r>
+          </w:p>
+        </w:tc>
+        <w:tc>
+          <w:tcPr>
+            <w:tcW w:w="2254" w:type="dxa"/>
+          </w:tcPr>
+          <w:p>
+            <w:pPr>
+              <w:jc w:val="right"/>
+              <w:cnfStyle w:val="000000000000" w:firstRow="0" w:lastRow="0" w:firstColumn="0" w:lastColumn="0" w:oddVBand="0" w:evenVBand="0" w:oddHBand="0" w:evenHBand="0" w:firstRowFirstColumn="0" w:firstRowLastColumn="0" w:lastRowFirstColumn="0" w:lastRowLastColumn="0"/>
+            </w:pPr>
+          </w:p>
+        </w:tc>
+        <w:tc>
+          <w:tcPr>
+            <w:tcW w:w="2254" w:type="dxa"/>
+          </w:tcPr>
+          <w:p>
+            <w:pPr>
+              <w:jc w:val="right"/>
+              <w:cnfStyle w:val="000000000000" w:firstRow="0" w:lastRow="0" w:firstColumn="0" w:lastColumn="0" w:oddVBand="0" w:evenVBand="0" w:oddHBand="0" w:evenHBand="0" w:firstRowFirstColumn="0" w:firstRowLastColumn="0" w:lastRowFirstColumn="0" w:lastRowLastColumn="0"/>
+            </w:pPr>
+          </w:p>
+        </w:tc>
+      </w:tr>
+      <w:tr>
+        <w:trPr>
+          <w:cnfStyle w:val="000000100000" w:firstRow="0" w:lastRow="0" w:firstColumn="0" w:lastColumn="0" w:oddVBand="0" w:evenVBand="0" w:oddHBand="1" w:evenHBand="0" w:firstRowFirstColumn="0" w:firstRowLastColumn="0" w:lastRowFirstColumn="0" w:lastRowLastColumn="0"/>
+        </w:trPr>
+        <w:tc>
+          <w:tcPr>
+            <w:cnfStyle w:val="001000000000" w:firstRow="0" w:lastRow="0" w:firstColumn="1" w:lastColumn="0" w:oddVBand="0" w:evenVBand="0" w:oddHBand="0" w:evenHBand="0" w:firstRowFirstColumn="0" w:firstRowLastColumn="0" w:lastRowFirstColumn="0" w:lastRowLastColumn="0"/>
+            <w:tcW w:w="2254" w:type="dxa"/>
+          </w:tcPr>
+          <w:p/>
+        </w:tc>
+        <w:tc>
+          <w:tcPr>
+            <w:tcW w:w="2254" w:type="dxa"/>
+          </w:tcPr>
+          <w:p>
+            <w:pPr>
+              <w:jc w:val="right"/>
+              <w:cnfStyle w:val="000000100000" w:firstRow="0" w:lastRow="0" w:firstColumn="0" w:lastColumn="0" w:oddVBand="0" w:evenVBand="0" w:oddHBand="1" w:evenHBand="0" w:firstRowFirstColumn="0" w:firstRowLastColumn="0" w:lastRowFirstColumn="0" w:lastRowLastColumn="0"/>
+            </w:pPr>
+            <w:r>
+              <w:t>IN4</w:t>
+            </w:r>
+          </w:p>
+        </w:tc>
+        <w:tc>
+          <w:tcPr>
+            <w:tcW w:w="2254" w:type="dxa"/>
+          </w:tcPr>
+          <w:p>
+            <w:pPr>
+              <w:jc w:val="right"/>
+              <w:cnfStyle w:val="000000100000" w:firstRow="0" w:lastRow="0" w:firstColumn="0" w:lastColumn="0" w:oddVBand="0" w:evenVBand="0" w:oddHBand="1" w:evenHBand="0" w:firstRowFirstColumn="0" w:firstRowLastColumn="0" w:lastRowFirstColumn="0" w:lastRowLastColumn="0"/>
+            </w:pPr>
+          </w:p>
+        </w:tc>
+        <w:tc>
+          <w:tcPr>
+            <w:tcW w:w="2254" w:type="dxa"/>
+          </w:tcPr>
+          <w:p>
+            <w:pPr>
+              <w:jc w:val="right"/>
+              <w:cnfStyle w:val="000000100000" w:firstRow="0" w:lastRow="0" w:firstColumn="0" w:lastColumn="0" w:oddVBand="0" w:evenVBand="0" w:oddHBand="1" w:evenHBand="0" w:firstRowFirstColumn="0" w:firstRowLastColumn="0" w:lastRowFirstColumn="0" w:lastRowLastColumn="0"/>
+            </w:pPr>
+          </w:p>
+        </w:tc>
+      </w:tr>
+      <w:tr>
+        <w:tc>
+          <w:tcPr>
+            <w:cnfStyle w:val="001000000000" w:firstRow="0" w:lastRow="0" w:firstColumn="1" w:lastColumn="0" w:oddVBand="0" w:evenVBand="0" w:oddHBand="0" w:evenHBand="0" w:firstRowFirstColumn="0" w:firstRowLastColumn="0" w:lastRowFirstColumn="0" w:lastRowLastColumn="0"/>
+            <w:tcW w:w="2254" w:type="dxa"/>
+          </w:tcPr>
+          <w:p/>
+        </w:tc>
+        <w:tc>
+          <w:tcPr>
+            <w:tcW w:w="2254" w:type="dxa"/>
+          </w:tcPr>
+          <w:p>
+            <w:pPr>
+              <w:jc w:val="right"/>
+              <w:cnfStyle w:val="000000000000" w:firstRow="0" w:lastRow="0" w:firstColumn="0" w:lastColumn="0" w:oddVBand="0" w:evenVBand="0" w:oddHBand="0" w:evenHBand="0" w:firstRowFirstColumn="0" w:firstRowLastColumn="0" w:lastRowFirstColumn="0" w:lastRowLastColumn="0"/>
+            </w:pPr>
+            <w:r>
+              <w:t>ENB</w:t>
+            </w:r>
+          </w:p>
+        </w:tc>
+        <w:tc>
+          <w:tcPr>
+            <w:tcW w:w="2254" w:type="dxa"/>
+          </w:tcPr>
+          <w:p>
+            <w:pPr>
+              <w:jc w:val="right"/>
+              <w:cnfStyle w:val="000000000000" w:firstRow="0" w:lastRow="0" w:firstColumn="0" w:lastColumn="0" w:oddVBand="0" w:evenVBand="0" w:oddHBand="0" w:evenHBand="0" w:firstRowFirstColumn="0" w:firstRowLastColumn="0" w:lastRowFirstColumn="0" w:lastRowLastColumn="0"/>
+            </w:pPr>
+          </w:p>
+        </w:tc>
+        <w:tc>
+          <w:tcPr>
+            <w:tcW w:w="2254" w:type="dxa"/>
+          </w:tcPr>
+          <w:p>
+            <w:pPr>
+              <w:jc w:val="right"/>
+              <w:cnfStyle w:val="000000000000" w:firstRow="0" w:lastRow="0" w:firstColumn="0" w:lastColumn="0" w:oddVBand="0" w:evenVBand="0" w:oddHBand="0" w:evenHBand="0" w:firstRowFirstColumn="0" w:firstRowLastColumn="0" w:lastRowFirstColumn="0" w:lastRowLastColumn="0"/>
+            </w:pPr>
+          </w:p>
+        </w:tc>
+      </w:tr>
+      <w:tr>
+        <w:trPr>
+          <w:cnfStyle w:val="000000100000" w:firstRow="0" w:lastRow="0" w:firstColumn="0" w:lastColumn="0" w:oddVBand="0" w:evenVBand="0" w:oddHBand="1" w:evenHBand="0" w:firstRowFirstColumn="0" w:firstRowLastColumn="0" w:lastRowFirstColumn="0" w:lastRowLastColumn="0"/>
+        </w:trPr>
+        <w:tc>
+          <w:tcPr>
+            <w:cnfStyle w:val="001000000000" w:firstRow="0" w:lastRow="0" w:firstColumn="1" w:lastColumn="0" w:oddVBand="0" w:evenVBand="0" w:oddHBand="0" w:evenHBand="0" w:firstRowFirstColumn="0" w:firstRowLastColumn="0" w:lastRowFirstColumn="0" w:lastRowLastColumn="0"/>
+            <w:tcW w:w="2254" w:type="dxa"/>
+          </w:tcPr>
+          <w:p>
+            <w:r>
+              <w:t>LEFT MOTOR</w:t>
+            </w:r>
+          </w:p>
+        </w:tc>
+        <w:tc>
+          <w:tcPr>
+            <w:tcW w:w="2254" w:type="dxa"/>
+          </w:tcPr>
+          <w:p>
+            <w:pPr>
+              <w:jc w:val="right"/>
+              <w:cnfStyle w:val="000000100000" w:firstRow="0" w:lastRow="0" w:firstColumn="0" w:lastColumn="0" w:oddVBand="0" w:evenVBand="0" w:oddHBand="1" w:evenHBand="0" w:firstRowFirstColumn="0" w:firstRowLastColumn="0" w:lastRowFirstColumn="0" w:lastRowLastColumn="0"/>
+            </w:pPr>
+            <w:r>
+              <w:t>TERMINALS</w:t>
+            </w:r>
+          </w:p>
+        </w:tc>
+        <w:tc>
+          <w:tcPr>
+            <w:tcW w:w="2254" w:type="dxa"/>
+          </w:tcPr>
+          <w:p>
+            <w:pPr>
+              <w:jc w:val="right"/>
+              <w:cnfStyle w:val="000000100000" w:firstRow="0" w:lastRow="0" w:firstColumn="0" w:lastColumn="0" w:oddVBand="0" w:evenVBand="0" w:oddHBand="1" w:evenHBand="0" w:firstRowFirstColumn="0" w:firstRowLastColumn="0" w:lastRowFirstColumn="0" w:lastRowLastColumn="0"/>
+            </w:pPr>
+          </w:p>
+        </w:tc>
+        <w:tc>
+          <w:tcPr>
+            <w:tcW w:w="2254" w:type="dxa"/>
+          </w:tcPr>
+          <w:p>
+            <w:pPr>
+              <w:jc w:val="right"/>
+              <w:cnfStyle w:val="000000100000" w:firstRow="0" w:lastRow="0" w:firstColumn="0" w:lastColumn="0" w:oddVBand="0" w:evenVBand="0" w:oddHBand="1" w:evenHBand="0" w:firstRowFirstColumn="0" w:firstRowLastColumn="0" w:lastRowFirstColumn="0" w:lastRowLastColumn="0"/>
+            </w:pPr>
+          </w:p>
+        </w:tc>
+      </w:tr>
+      <w:tr>
+        <w:tc>
+          <w:tcPr>
+            <w:cnfStyle w:val="001000000000" w:firstRow="0" w:lastRow="0" w:firstColumn="1" w:lastColumn="0" w:oddVBand="0" w:evenVBand="0" w:oddHBand="0" w:evenHBand="0" w:firstRowFirstColumn="0" w:firstRowLastColumn="0" w:lastRowFirstColumn="0" w:lastRowLastColumn="0"/>
+            <w:tcW w:w="2254" w:type="dxa"/>
+          </w:tcPr>
+          <w:p>
+            <w:r>
+              <w:t>RIGHT MOTOR</w:t>
+            </w:r>
+          </w:p>
+        </w:tc>
+        <w:tc>
+          <w:tcPr>
+            <w:tcW w:w="2254" w:type="dxa"/>
+          </w:tcPr>
+          <w:p>
+            <w:pPr>
+              <w:jc w:val="right"/>
+              <w:cnfStyle w:val="000000000000" w:firstRow="0" w:lastRow="0" w:firstColumn="0" w:lastColumn="0" w:oddVBand="0" w:evenVBand="0" w:oddHBand="0" w:evenHBand="0" w:firstRowFirstColumn="0" w:firstRowLastColumn="0" w:lastRowFirstColumn="0" w:lastRowLastColumn="0"/>
+            </w:pPr>
+            <w:r>
+              <w:t>TERMINALS</w:t>
+            </w:r>
+          </w:p>
+        </w:tc>
+        <w:tc>
+          <w:tcPr>
+            <w:tcW w:w="2254" w:type="dxa"/>
+          </w:tcPr>
+          <w:p>
+            <w:pPr>
+              <w:jc w:val="right"/>
+              <w:cnfStyle w:val="000000000000" w:firstRow="0" w:lastRow="0" w:firstColumn="0" w:lastColumn="0" w:oddVBand="0" w:evenVBand="0" w:oddHBand="0" w:evenHBand="0" w:firstRowFirstColumn="0" w:firstRowLastColumn="0" w:lastRowFirstColumn="0" w:lastRowLastColumn="0"/>
+            </w:pPr>
+          </w:p>
+        </w:tc>
+        <w:tc>
+          <w:tcPr>
+            <w:tcW w:w="2254" w:type="dxa"/>
+          </w:tcPr>
+          <w:p>
+            <w:pPr>
+              <w:jc w:val="right"/>
+              <w:cnfStyle w:val="000000000000" w:firstRow="0" w:lastRow="0" w:firstColumn="0" w:lastColumn="0" w:oddVBand="0" w:evenVBand="0" w:oddHBand="0" w:evenHBand="0" w:firstRowFirstColumn="0" w:firstRowLastColumn="0" w:lastRowFirstColumn="0" w:lastRowLastColumn="0"/>
+            </w:pPr>
+          </w:p>
+        </w:tc>
+      </w:tr>
+      <w:tr>
+        <w:trPr>
+          <w:cnfStyle w:val="000000100000" w:firstRow="0" w:lastRow="0" w:firstColumn="0" w:lastColumn="0" w:oddVBand="0" w:evenVBand="0" w:oddHBand="1" w:evenHBand="0" w:firstRowFirstColumn="0" w:firstRowLastColumn="0" w:lastRowFirstColumn="0" w:lastRowLastColumn="0"/>
+        </w:trPr>
+        <w:tc>
+          <w:tcPr>
+            <w:cnfStyle w:val="001000000000" w:firstRow="0" w:lastRow="0" w:firstColumn="1" w:lastColumn="0" w:oddVBand="0" w:evenVBand="0" w:oddHBand="0" w:evenHBand="0" w:firstRowFirstColumn="0" w:firstRowLastColumn="0" w:lastRowFirstColumn="0" w:lastRowLastColumn="0"/>
+            <w:tcW w:w="2254" w:type="dxa"/>
+          </w:tcPr>
+          <w:p>
+            <w:r>
+              <w:t>BATTERY</w:t>
+            </w:r>
+          </w:p>
+        </w:tc>
+        <w:tc>
+          <w:tcPr>
+            <w:tcW w:w="2254" w:type="dxa"/>
+          </w:tcPr>
+          <w:p>
+            <w:pPr>
+              <w:jc w:val="right"/>
+              <w:cnfStyle w:val="000000100000" w:firstRow="0" w:lastRow="0" w:firstColumn="0" w:lastColumn="0" w:oddVBand="0" w:evenVBand="0" w:oddHBand="1" w:evenHBand="0" w:firstRowFirstColumn="0" w:firstRowLastColumn="0" w:lastRowFirstColumn="0" w:lastRowLastColumn="0"/>
+            </w:pPr>
+            <w:r>
+              <w:t>POSITIVE</w:t>
+            </w:r>
+          </w:p>
+        </w:tc>
+        <w:tc>
+          <w:tcPr>
+            <w:tcW w:w="2254" w:type="dxa"/>
+          </w:tcPr>
+          <w:p>
+            <w:pPr>
+              <w:jc w:val="right"/>
+              <w:cnfStyle w:val="000000100000" w:firstRow="0" w:lastRow="0" w:firstColumn="0" w:lastColumn="0" w:oddVBand="0" w:evenVBand="0" w:oddHBand="1" w:evenHBand="0" w:firstRowFirstColumn="0" w:firstRowLastColumn="0" w:lastRowFirstColumn="0" w:lastRowLastColumn="0"/>
+            </w:pPr>
+          </w:p>
+        </w:tc>
+        <w:tc>
+          <w:tcPr>
+            <w:tcW w:w="2254" w:type="dxa"/>
+          </w:tcPr>
+          <w:p>
+            <w:pPr>
+              <w:jc w:val="right"/>
+              <w:cnfStyle w:val="000000100000" w:firstRow="0" w:lastRow="0" w:firstColumn="0" w:lastColumn="0" w:oddVBand="0" w:evenVBand="0" w:oddHBand="1" w:evenHBand="0" w:firstRowFirstColumn="0" w:firstRowLastColumn="0" w:lastRowFirstColumn="0" w:lastRowLastColumn="0"/>
+            </w:pPr>
+          </w:p>
+        </w:tc>
+      </w:tr>
+      <w:tr>
+        <w:tc>
+          <w:tcPr>
+            <w:cnfStyle w:val="001000000000" w:firstRow="0" w:lastRow="0" w:firstColumn="1" w:lastColumn="0" w:oddVBand="0" w:evenVBand="0" w:oddHBand="0" w:evenHBand="0" w:firstRowFirstColumn="0" w:firstRowLastColumn="0" w:lastRowFirstColumn="0" w:lastRowLastColumn="0"/>
+            <w:tcW w:w="2254" w:type="dxa"/>
+          </w:tcPr>
+          <w:p/>
+        </w:tc>
+        <w:tc>
+          <w:tcPr>
+            <w:tcW w:w="2254" w:type="dxa"/>
+          </w:tcPr>
+          <w:p>
+            <w:pPr>
+              <w:jc w:val="right"/>
+              <w:cnfStyle w:val="000000000000" w:firstRow="0" w:lastRow="0" w:firstColumn="0" w:lastColumn="0" w:oddVBand="0" w:evenVBand="0" w:oddHBand="0" w:evenHBand="0" w:firstRowFirstColumn="0" w:firstRowLastColumn="0" w:lastRowFirstColumn="0" w:lastRowLastColumn="0"/>
+            </w:pPr>
+            <w:r>
+              <w:t>NEGATIVE</w:t>
+            </w:r>
+          </w:p>
+        </w:tc>
+        <w:tc>
+          <w:tcPr>
+            <w:tcW w:w="2254" w:type="dxa"/>
+          </w:tcPr>
+          <w:p>
+            <w:pPr>
+              <w:jc w:val="right"/>
+              <w:cnfStyle w:val="000000000000" w:firstRow="0" w:lastRow="0" w:firstColumn="0" w:lastColumn="0" w:oddVBand="0" w:evenVBand="0" w:oddHBand="0" w:evenHBand="0" w:firstRowFirstColumn="0" w:firstRowLastColumn="0" w:lastRowFirstColumn="0" w:lastRowLastColumn="0"/>
+            </w:pPr>
+          </w:p>
+        </w:tc>
+        <w:tc>
+          <w:tcPr>
+            <w:tcW w:w="2254" w:type="dxa"/>
+          </w:tcPr>
+          <w:p>
+            <w:pPr>
+              <w:jc w:val="right"/>
+              <w:cnfStyle w:val="000000000000" w:firstRow="0" w:lastRow="0" w:firstColumn="0" w:lastColumn="0" w:oddVBand="0" w:evenVBand="0" w:oddHBand="0" w:evenHBand="0" w:firstRowFirstColumn="0" w:firstRowLastColumn="0" w:lastRowFirstColumn="0" w:lastRowLastColumn="0"/>
+            </w:pPr>
+          </w:p>
+        </w:tc>
+      </w:tr>
+      <w:tr>
+        <w:trPr>
+          <w:cnfStyle w:val="000000100000" w:firstRow="0" w:lastRow="0" w:firstColumn="0" w:lastColumn="0" w:oddVBand="0" w:evenVBand="0" w:oddHBand="1" w:evenHBand="0" w:firstRowFirstColumn="0" w:firstRowLastColumn="0" w:lastRowFirstColumn="0" w:lastRowLastColumn="0"/>
+        </w:trPr>
+        <w:tc>
+          <w:tcPr>
+            <w:cnfStyle w:val="001000000000" w:firstRow="0" w:lastRow="0" w:firstColumn="1" w:lastColumn="0" w:oddVBand="0" w:evenVBand="0" w:oddHBand="0" w:evenHBand="0" w:firstRowFirstColumn="0" w:firstRowLastColumn="0" w:lastRowFirstColumn="0" w:lastRowLastColumn="0"/>
+            <w:tcW w:w="2254" w:type="dxa"/>
+          </w:tcPr>
+          <w:p>
+            <w:r>
+              <w:t>ARDUINO UNO</w:t>
+            </w:r>
+          </w:p>
+        </w:tc>
+        <w:tc>
+          <w:tcPr>
+            <w:tcW w:w="2254" w:type="dxa"/>
+          </w:tcPr>
+          <w:p>
+            <w:pPr>
+              <w:jc w:val="right"/>
+              <w:cnfStyle w:val="000000100000" w:firstRow="0" w:lastRow="0" w:firstColumn="0" w:lastColumn="0" w:oddVBand="0" w:evenVBand="0" w:oddHBand="1" w:evenHBand="0" w:firstRowFirstColumn="0" w:firstRowLastColumn="0" w:lastRowFirstColumn="0" w:lastRowLastColumn="0"/>
+            </w:pPr>
+            <w:r>
+              <w:t>GROUND</w:t>
+            </w:r>
+          </w:p>
+        </w:tc>
+        <w:tc>
+          <w:tcPr>
+            <w:tcW w:w="2254" w:type="dxa"/>
+          </w:tcPr>
+          <w:p>
+            <w:pPr>
+              <w:jc w:val="right"/>
+              <w:cnfStyle w:val="000000100000" w:firstRow="0" w:lastRow="0" w:firstColumn="0" w:lastColumn="0" w:oddVBand="0" w:evenVBand="0" w:oddHBand="1" w:evenHBand="0" w:firstRowFirstColumn="0" w:firstRowLastColumn="0" w:lastRowFirstColumn="0" w:lastRowLastColumn="0"/>
+            </w:pPr>
+          </w:p>
+        </w:tc>
+        <w:tc>
+          <w:tcPr>
+            <w:tcW w:w="2254" w:type="dxa"/>
+          </w:tcPr>
+          <w:p>
+            <w:pPr>
+              <w:jc w:val="right"/>
+              <w:cnfStyle w:val="000000100000" w:firstRow="0" w:lastRow="0" w:firstColumn="0" w:lastColumn="0" w:oddVBand="0" w:evenVBand="0" w:oddHBand="1" w:evenHBand="0" w:firstRowFirstColumn="0" w:firstRowLastColumn="0" w:lastRowFirstColumn="0" w:lastRowLastColumn="0"/>
+            </w:pPr>
+          </w:p>
+        </w:tc>
+      </w:tr>
+    </w:tbl>
+    <w:p/>
     <w:p>
       <w:pPr>
         <w:rPr>
@@ -3369,6 +4285,433 @@
       <w:smallCaps/>
     </w:rPr>
   </w:style>
+  <w:style w:type="table" w:styleId="TableGrid">
+    <w:name w:val="Table Grid"/>
+    <w:basedOn w:val="TableNormal"/>
+    <w:uiPriority w:val="39"/>
+    <w:rsid w:val="0079678F"/>
+    <w:pPr>
+      <w:spacing w:after="0" w:line="240" w:lineRule="auto"/>
+    </w:pPr>
+    <w:tblPr>
+      <w:tblBorders>
+        <w:top w:val="single" w:sz="4" w:space="0" w:color="auto"/>
+        <w:left w:val="single" w:sz="4" w:space="0" w:color="auto"/>
+        <w:bottom w:val="single" w:sz="4" w:space="0" w:color="auto"/>
+        <w:right w:val="single" w:sz="4" w:space="0" w:color="auto"/>
+        <w:insideH w:val="single" w:sz="4" w:space="0" w:color="auto"/>
+        <w:insideV w:val="single" w:sz="4" w:space="0" w:color="auto"/>
+      </w:tblBorders>
+    </w:tblPr>
+  </w:style>
+  <w:style w:type="table" w:styleId="GridTable3-Accent4">
+    <w:name w:val="Grid Table 3 Accent 4"/>
+    <w:basedOn w:val="TableNormal"/>
+    <w:uiPriority w:val="48"/>
+    <w:rsid w:val="0079678F"/>
+    <w:pPr>
+      <w:spacing w:after="0" w:line="240" w:lineRule="auto"/>
+    </w:pPr>
+    <w:tblPr>
+      <w:tblStyleRowBandSize w:val="1"/>
+      <w:tblStyleColBandSize w:val="1"/>
+      <w:tblBorders>
+        <w:top w:val="single" w:sz="4" w:space="0" w:color="A29ED4" w:themeColor="accent4" w:themeTint="99"/>
+        <w:left w:val="single" w:sz="4" w:space="0" w:color="A29ED4" w:themeColor="accent4" w:themeTint="99"/>
+        <w:bottom w:val="single" w:sz="4" w:space="0" w:color="A29ED4" w:themeColor="accent4" w:themeTint="99"/>
+        <w:right w:val="single" w:sz="4" w:space="0" w:color="A29ED4" w:themeColor="accent4" w:themeTint="99"/>
+        <w:insideH w:val="single" w:sz="4" w:space="0" w:color="A29ED4" w:themeColor="accent4" w:themeTint="99"/>
+        <w:insideV w:val="single" w:sz="4" w:space="0" w:color="A29ED4" w:themeColor="accent4" w:themeTint="99"/>
+      </w:tblBorders>
+    </w:tblPr>
+    <w:tblStylePr w:type="firstRow">
+      <w:rPr>
+        <w:b/>
+        <w:bCs/>
+      </w:rPr>
+      <w:tblPr/>
+      <w:tcPr>
+        <w:tcBorders>
+          <w:top w:val="nil"/>
+          <w:left w:val="nil"/>
+          <w:right w:val="nil"/>
+          <w:insideH w:val="nil"/>
+          <w:insideV w:val="nil"/>
+        </w:tcBorders>
+        <w:shd w:val="clear" w:color="auto" w:fill="FFFFFF" w:themeFill="background1"/>
+      </w:tcPr>
+    </w:tblStylePr>
+    <w:tblStylePr w:type="lastRow">
+      <w:rPr>
+        <w:b/>
+        <w:bCs/>
+      </w:rPr>
+      <w:tblPr/>
+      <w:tcPr>
+        <w:tcBorders>
+          <w:left w:val="nil"/>
+          <w:bottom w:val="nil"/>
+          <w:right w:val="nil"/>
+          <w:insideH w:val="nil"/>
+          <w:insideV w:val="nil"/>
+        </w:tcBorders>
+        <w:shd w:val="clear" w:color="auto" w:fill="FFFFFF" w:themeFill="background1"/>
+      </w:tcPr>
+    </w:tblStylePr>
+    <w:tblStylePr w:type="firstCol">
+      <w:pPr>
+        <w:jc w:val="right"/>
+      </w:pPr>
+      <w:rPr>
+        <w:i/>
+        <w:iCs/>
+      </w:rPr>
+      <w:tblPr/>
+      <w:tcPr>
+        <w:tcBorders>
+          <w:top w:val="nil"/>
+          <w:left w:val="nil"/>
+          <w:bottom w:val="nil"/>
+          <w:insideH w:val="nil"/>
+          <w:insideV w:val="nil"/>
+        </w:tcBorders>
+        <w:shd w:val="clear" w:color="auto" w:fill="FFFFFF" w:themeFill="background1"/>
+      </w:tcPr>
+    </w:tblStylePr>
+    <w:tblStylePr w:type="lastCol">
+      <w:rPr>
+        <w:i/>
+        <w:iCs/>
+      </w:rPr>
+      <w:tblPr/>
+      <w:tcPr>
+        <w:tcBorders>
+          <w:top w:val="nil"/>
+          <w:bottom w:val="nil"/>
+          <w:right w:val="nil"/>
+          <w:insideH w:val="nil"/>
+          <w:insideV w:val="nil"/>
+        </w:tcBorders>
+        <w:shd w:val="clear" w:color="auto" w:fill="FFFFFF" w:themeFill="background1"/>
+      </w:tcPr>
+    </w:tblStylePr>
+    <w:tblStylePr w:type="band1Vert">
+      <w:tblPr/>
+      <w:tcPr>
+        <w:shd w:val="clear" w:color="auto" w:fill="E0DEF0" w:themeFill="accent4" w:themeFillTint="33"/>
+      </w:tcPr>
+    </w:tblStylePr>
+    <w:tblStylePr w:type="band1Horz">
+      <w:tblPr/>
+      <w:tcPr>
+        <w:shd w:val="clear" w:color="auto" w:fill="E0DEF0" w:themeFill="accent4" w:themeFillTint="33"/>
+      </w:tcPr>
+    </w:tblStylePr>
+    <w:tblStylePr w:type="neCell">
+      <w:tblPr/>
+      <w:tcPr>
+        <w:tcBorders>
+          <w:bottom w:val="single" w:sz="4" w:space="0" w:color="A29ED4" w:themeColor="accent4" w:themeTint="99"/>
+        </w:tcBorders>
+      </w:tcPr>
+    </w:tblStylePr>
+    <w:tblStylePr w:type="nwCell">
+      <w:tblPr/>
+      <w:tcPr>
+        <w:tcBorders>
+          <w:bottom w:val="single" w:sz="4" w:space="0" w:color="A29ED4" w:themeColor="accent4" w:themeTint="99"/>
+        </w:tcBorders>
+      </w:tcPr>
+    </w:tblStylePr>
+    <w:tblStylePr w:type="seCell">
+      <w:tblPr/>
+      <w:tcPr>
+        <w:tcBorders>
+          <w:top w:val="single" w:sz="4" w:space="0" w:color="A29ED4" w:themeColor="accent4" w:themeTint="99"/>
+        </w:tcBorders>
+      </w:tcPr>
+    </w:tblStylePr>
+    <w:tblStylePr w:type="swCell">
+      <w:tblPr/>
+      <w:tcPr>
+        <w:tcBorders>
+          <w:top w:val="single" w:sz="4" w:space="0" w:color="A29ED4" w:themeColor="accent4" w:themeTint="99"/>
+        </w:tcBorders>
+      </w:tcPr>
+    </w:tblStylePr>
+  </w:style>
+  <w:style w:type="table" w:styleId="GridTable3-Accent1">
+    <w:name w:val="Grid Table 3 Accent 1"/>
+    <w:basedOn w:val="TableNormal"/>
+    <w:uiPriority w:val="48"/>
+    <w:rsid w:val="0079678F"/>
+    <w:pPr>
+      <w:spacing w:after="0" w:line="240" w:lineRule="auto"/>
+    </w:pPr>
+    <w:tblPr>
+      <w:tblStyleRowBandSize w:val="1"/>
+      <w:tblStyleColBandSize w:val="1"/>
+      <w:tblBorders>
+        <w:top w:val="single" w:sz="4" w:space="0" w:color="D565D2" w:themeColor="accent1" w:themeTint="99"/>
+        <w:left w:val="single" w:sz="4" w:space="0" w:color="D565D2" w:themeColor="accent1" w:themeTint="99"/>
+        <w:bottom w:val="single" w:sz="4" w:space="0" w:color="D565D2" w:themeColor="accent1" w:themeTint="99"/>
+        <w:right w:val="single" w:sz="4" w:space="0" w:color="D565D2" w:themeColor="accent1" w:themeTint="99"/>
+        <w:insideH w:val="single" w:sz="4" w:space="0" w:color="D565D2" w:themeColor="accent1" w:themeTint="99"/>
+        <w:insideV w:val="single" w:sz="4" w:space="0" w:color="D565D2" w:themeColor="accent1" w:themeTint="99"/>
+      </w:tblBorders>
+    </w:tblPr>
+    <w:tblStylePr w:type="firstRow">
+      <w:rPr>
+        <w:b/>
+        <w:bCs/>
+      </w:rPr>
+      <w:tblPr/>
+      <w:tcPr>
+        <w:tcBorders>
+          <w:top w:val="nil"/>
+          <w:left w:val="nil"/>
+          <w:right w:val="nil"/>
+          <w:insideH w:val="nil"/>
+          <w:insideV w:val="nil"/>
+        </w:tcBorders>
+        <w:shd w:val="clear" w:color="auto" w:fill="FFFFFF" w:themeFill="background1"/>
+      </w:tcPr>
+    </w:tblStylePr>
+    <w:tblStylePr w:type="lastRow">
+      <w:rPr>
+        <w:b/>
+        <w:bCs/>
+      </w:rPr>
+      <w:tblPr/>
+      <w:tcPr>
+        <w:tcBorders>
+          <w:left w:val="nil"/>
+          <w:bottom w:val="nil"/>
+          <w:right w:val="nil"/>
+          <w:insideH w:val="nil"/>
+          <w:insideV w:val="nil"/>
+        </w:tcBorders>
+        <w:shd w:val="clear" w:color="auto" w:fill="FFFFFF" w:themeFill="background1"/>
+      </w:tcPr>
+    </w:tblStylePr>
+    <w:tblStylePr w:type="firstCol">
+      <w:pPr>
+        <w:jc w:val="right"/>
+      </w:pPr>
+      <w:rPr>
+        <w:i/>
+        <w:iCs/>
+      </w:rPr>
+      <w:tblPr/>
+      <w:tcPr>
+        <w:tcBorders>
+          <w:top w:val="nil"/>
+          <w:left w:val="nil"/>
+          <w:bottom w:val="nil"/>
+          <w:insideH w:val="nil"/>
+          <w:insideV w:val="nil"/>
+        </w:tcBorders>
+        <w:shd w:val="clear" w:color="auto" w:fill="FFFFFF" w:themeFill="background1"/>
+      </w:tcPr>
+    </w:tblStylePr>
+    <w:tblStylePr w:type="lastCol">
+      <w:rPr>
+        <w:i/>
+        <w:iCs/>
+      </w:rPr>
+      <w:tblPr/>
+      <w:tcPr>
+        <w:tcBorders>
+          <w:top w:val="nil"/>
+          <w:bottom w:val="nil"/>
+          <w:right w:val="nil"/>
+          <w:insideH w:val="nil"/>
+          <w:insideV w:val="nil"/>
+        </w:tcBorders>
+        <w:shd w:val="clear" w:color="auto" w:fill="FFFFFF" w:themeFill="background1"/>
+      </w:tcPr>
+    </w:tblStylePr>
+    <w:tblStylePr w:type="band1Vert">
+      <w:tblPr/>
+      <w:tcPr>
+        <w:shd w:val="clear" w:color="auto" w:fill="F1CBF0" w:themeFill="accent1" w:themeFillTint="33"/>
+      </w:tcPr>
+    </w:tblStylePr>
+    <w:tblStylePr w:type="band1Horz">
+      <w:tblPr/>
+      <w:tcPr>
+        <w:shd w:val="clear" w:color="auto" w:fill="F1CBF0" w:themeFill="accent1" w:themeFillTint="33"/>
+      </w:tcPr>
+    </w:tblStylePr>
+    <w:tblStylePr w:type="neCell">
+      <w:tblPr/>
+      <w:tcPr>
+        <w:tcBorders>
+          <w:bottom w:val="single" w:sz="4" w:space="0" w:color="D565D2" w:themeColor="accent1" w:themeTint="99"/>
+        </w:tcBorders>
+      </w:tcPr>
+    </w:tblStylePr>
+    <w:tblStylePr w:type="nwCell">
+      <w:tblPr/>
+      <w:tcPr>
+        <w:tcBorders>
+          <w:bottom w:val="single" w:sz="4" w:space="0" w:color="D565D2" w:themeColor="accent1" w:themeTint="99"/>
+        </w:tcBorders>
+      </w:tcPr>
+    </w:tblStylePr>
+    <w:tblStylePr w:type="seCell">
+      <w:tblPr/>
+      <w:tcPr>
+        <w:tcBorders>
+          <w:top w:val="single" w:sz="4" w:space="0" w:color="D565D2" w:themeColor="accent1" w:themeTint="99"/>
+        </w:tcBorders>
+      </w:tcPr>
+    </w:tblStylePr>
+    <w:tblStylePr w:type="swCell">
+      <w:tblPr/>
+      <w:tcPr>
+        <w:tcBorders>
+          <w:top w:val="single" w:sz="4" w:space="0" w:color="D565D2" w:themeColor="accent1" w:themeTint="99"/>
+        </w:tcBorders>
+      </w:tcPr>
+    </w:tblStylePr>
+  </w:style>
+  <w:style w:type="table" w:styleId="GridTable3-Accent6">
+    <w:name w:val="Grid Table 3 Accent 6"/>
+    <w:basedOn w:val="TableNormal"/>
+    <w:uiPriority w:val="48"/>
+    <w:rsid w:val="00E560E6"/>
+    <w:pPr>
+      <w:spacing w:after="0" w:line="240" w:lineRule="auto"/>
+    </w:pPr>
+    <w:tblPr>
+      <w:tblStyleRowBandSize w:val="1"/>
+      <w:tblStyleColBandSize w:val="1"/>
+      <w:tblBorders>
+        <w:top w:val="single" w:sz="4" w:space="0" w:color="9BB3E9" w:themeColor="accent6" w:themeTint="99"/>
+        <w:left w:val="single" w:sz="4" w:space="0" w:color="9BB3E9" w:themeColor="accent6" w:themeTint="99"/>
+        <w:bottom w:val="single" w:sz="4" w:space="0" w:color="9BB3E9" w:themeColor="accent6" w:themeTint="99"/>
+        <w:right w:val="single" w:sz="4" w:space="0" w:color="9BB3E9" w:themeColor="accent6" w:themeTint="99"/>
+        <w:insideH w:val="single" w:sz="4" w:space="0" w:color="9BB3E9" w:themeColor="accent6" w:themeTint="99"/>
+        <w:insideV w:val="single" w:sz="4" w:space="0" w:color="9BB3E9" w:themeColor="accent6" w:themeTint="99"/>
+      </w:tblBorders>
+    </w:tblPr>
+    <w:tblStylePr w:type="firstRow">
+      <w:rPr>
+        <w:b/>
+        <w:bCs/>
+      </w:rPr>
+      <w:tblPr/>
+      <w:tcPr>
+        <w:tcBorders>
+          <w:top w:val="nil"/>
+          <w:left w:val="nil"/>
+          <w:right w:val="nil"/>
+          <w:insideH w:val="nil"/>
+          <w:insideV w:val="nil"/>
+        </w:tcBorders>
+        <w:shd w:val="clear" w:color="auto" w:fill="FFFFFF" w:themeFill="background1"/>
+      </w:tcPr>
+    </w:tblStylePr>
+    <w:tblStylePr w:type="lastRow">
+      <w:rPr>
+        <w:b/>
+        <w:bCs/>
+      </w:rPr>
+      <w:tblPr/>
+      <w:tcPr>
+        <w:tcBorders>
+          <w:left w:val="nil"/>
+          <w:bottom w:val="nil"/>
+          <w:right w:val="nil"/>
+          <w:insideH w:val="nil"/>
+          <w:insideV w:val="nil"/>
+        </w:tcBorders>
+        <w:shd w:val="clear" w:color="auto" w:fill="FFFFFF" w:themeFill="background1"/>
+      </w:tcPr>
+    </w:tblStylePr>
+    <w:tblStylePr w:type="firstCol">
+      <w:pPr>
+        <w:jc w:val="right"/>
+      </w:pPr>
+      <w:rPr>
+        <w:i/>
+        <w:iCs/>
+      </w:rPr>
+      <w:tblPr/>
+      <w:tcPr>
+        <w:tcBorders>
+          <w:top w:val="nil"/>
+          <w:left w:val="nil"/>
+          <w:bottom w:val="nil"/>
+          <w:insideH w:val="nil"/>
+          <w:insideV w:val="nil"/>
+        </w:tcBorders>
+        <w:shd w:val="clear" w:color="auto" w:fill="FFFFFF" w:themeFill="background1"/>
+      </w:tcPr>
+    </w:tblStylePr>
+    <w:tblStylePr w:type="lastCol">
+      <w:rPr>
+        <w:i/>
+        <w:iCs/>
+      </w:rPr>
+      <w:tblPr/>
+      <w:tcPr>
+        <w:tcBorders>
+          <w:top w:val="nil"/>
+          <w:bottom w:val="nil"/>
+          <w:right w:val="nil"/>
+          <w:insideH w:val="nil"/>
+          <w:insideV w:val="nil"/>
+        </w:tcBorders>
+        <w:shd w:val="clear" w:color="auto" w:fill="FFFFFF" w:themeFill="background1"/>
+      </w:tcPr>
+    </w:tblStylePr>
+    <w:tblStylePr w:type="band1Vert">
+      <w:tblPr/>
+      <w:tcPr>
+        <w:shd w:val="clear" w:color="auto" w:fill="DDE5F7" w:themeFill="accent6" w:themeFillTint="33"/>
+      </w:tcPr>
+    </w:tblStylePr>
+    <w:tblStylePr w:type="band1Horz">
+      <w:tblPr/>
+      <w:tcPr>
+        <w:shd w:val="clear" w:color="auto" w:fill="DDE5F7" w:themeFill="accent6" w:themeFillTint="33"/>
+      </w:tcPr>
+    </w:tblStylePr>
+    <w:tblStylePr w:type="neCell">
+      <w:tblPr/>
+      <w:tcPr>
+        <w:tcBorders>
+          <w:bottom w:val="single" w:sz="4" w:space="0" w:color="9BB3E9" w:themeColor="accent6" w:themeTint="99"/>
+        </w:tcBorders>
+      </w:tcPr>
+    </w:tblStylePr>
+    <w:tblStylePr w:type="nwCell">
+      <w:tblPr/>
+      <w:tcPr>
+        <w:tcBorders>
+          <w:bottom w:val="single" w:sz="4" w:space="0" w:color="9BB3E9" w:themeColor="accent6" w:themeTint="99"/>
+        </w:tcBorders>
+      </w:tcPr>
+    </w:tblStylePr>
+    <w:tblStylePr w:type="seCell">
+      <w:tblPr/>
+      <w:tcPr>
+        <w:tcBorders>
+          <w:top w:val="single" w:sz="4" w:space="0" w:color="9BB3E9" w:themeColor="accent6" w:themeTint="99"/>
+        </w:tcBorders>
+      </w:tcPr>
+    </w:tblStylePr>
+    <w:tblStylePr w:type="swCell">
+      <w:tblPr/>
+      <w:tcPr>
+        <w:tcBorders>
+          <w:top w:val="single" w:sz="4" w:space="0" w:color="9BB3E9" w:themeColor="accent6" w:themeTint="99"/>
+        </w:tcBorders>
+      </w:tcPr>
+    </w:tblStylePr>
+  </w:style>
 </w:styles>
 </file>
 

</xml_diff>